<commit_message>
feat(spt): sppd_template memuat tag bidang/KTU + tabel paraf (3 salinan)
</commit_message>
<xml_diff>
--- a/public/sppd_template.docx
+++ b/public/sppd_template.docx
@@ -3458,9 +3458,29 @@
             </w:pPr>
             <w:r>
               <w:rPr>
-                <w:rtl w:val="0"/>
-              </w:rPr>
-            </w:r>
+                <w:rFonts w:ascii="Arial" w:cs="Arial" w:eastAsia="Arial" w:hAnsi="Arial"/>
+                <w:sz w:val="22"/>
+                <w:szCs w:val="22"/>
+              </w:rPr>
+              <w:t xml:space="preserve">{KtuNama}</w:t>
+            </w:r>
+            <w:p>
+              <w:pPr>
+                <w:rPr>
+                  <w:rFonts w:ascii="Arial" w:cs="Arial" w:eastAsia="Arial" w:hAnsi="Arial"/>
+                  <w:sz w:val="22"/>
+                  <w:szCs w:val="22"/>
+                </w:rPr>
+              </w:pPr>
+              <w:r>
+                <w:rPr>
+                  <w:rFonts w:ascii="Arial" w:cs="Arial" w:eastAsia="Arial" w:hAnsi="Arial"/>
+                  <w:sz w:val="22"/>
+                  <w:szCs w:val="22"/>
+                </w:rPr>
+                <w:t xml:space="preserve">NIP. {KtuNIP}</w:t>
+              </w:r>
+            </w:p>
           </w:p>
         </w:tc>
       </w:tr>
@@ -4214,7 +4234,7 @@
                 <w:u w:val="single"/>
                 <w:rtl w:val="0"/>
               </w:rPr>
-              <w:t xml:space="preserve">BERLIAN MAGU WERU,S.Sos</w:t>
+              <w:t xml:space="preserve">{BidangNama}</w:t>
             </w:r>
             <w:r>
               <w:rPr>
@@ -4238,7 +4258,7 @@
                 <w:szCs w:val="22"/>
                 <w:rtl w:val="0"/>
               </w:rPr>
-              <w:t xml:space="preserve">Nip. 19690619 200903 1 001</w:t>
+              <w:t xml:space="preserve">NIP. {BidangNIP}</w:t>
             </w:r>
           </w:p>
         </w:tc>
@@ -6166,6 +6186,310 @@
         </w:rPr>
       </w:r>
     </w:p>
+    <w:p>
+      <w:pPr>
+        <w:jc w:val="left"/>
+        <w:rPr>
+          <w:rFonts w:ascii="Arial" w:cs="Arial" w:eastAsia="Arial" w:hAnsi="Arial"/>
+          <w:b/>
+          <w:sz w:val="24"/>
+        </w:rPr>
+      </w:pPr>
+      <w:r>
+        <w:rPr>
+          <w:rFonts w:ascii="Arial" w:cs="Arial" w:eastAsia="Arial" w:hAnsi="Arial"/>
+          <w:b/>
+          <w:sz w:val="24"/>
+        </w:rPr>
+        <w:t xml:space="preserve">Paraf:</w:t>
+      </w:r>
+    </w:p>
+    <w:tbl>
+      <w:tblPr>
+        <w:tblStyle w:val="TableGrid"/>
+        <w:tblW w:w="0" w:type="auto"/>
+        <w:tblLook w:val="04A0" w:firstRow="1" w:lastRow="0" w:firstColumn="1" w:lastColumn="0" w:noHBand="0" w:noVBand="1"/>
+      </w:tblPr>
+      <w:tblGrid>
+        <w:gridCol w:w="586"/>
+        <w:gridCol w:w="3277"/>
+        <w:gridCol w:w="914"/>
+      </w:tblGrid>
+      <w:tr>
+        <w:trPr>
+          <w:trHeight w:val="328"/>
+        </w:trPr>
+        <w:tc>
+          <w:tcPr>
+            <w:tcW w:w="546" w:type="dxa"/>
+            <w:vAlign w:val="center"/>
+          </w:tcPr>
+          <w:p>
+            <w:pPr>
+              <w:spacing w:after="160" w:line="259" w:lineRule="auto"/>
+              <w:jc w:val="center"/>
+              <w:rPr>
+                <w:rFonts w:ascii="Arial" w:hAnsi="Arial" w:cs="Arial"/>
+                <w:b/>
+                <w:sz w:val="24"/>
+              </w:rPr>
+            </w:pPr>
+            <w:r>
+              <w:rPr>
+                <w:rFonts w:ascii="Arial" w:hAnsi="Arial" w:cs="Arial"/>
+                <w:b/>
+                <w:sz w:val="24"/>
+              </w:rPr>
+              <w:t>NO</w:t>
+            </w:r>
+          </w:p>
+        </w:tc>
+        <w:tc>
+          <w:tcPr>
+            <w:tcW w:w="4191" w:type="dxa"/>
+            <w:gridSpan w:val="2"/>
+            <w:vAlign w:val="center"/>
+          </w:tcPr>
+          <w:p>
+            <w:pPr>
+              <w:spacing w:after="160" w:line="259" w:lineRule="auto"/>
+              <w:jc w:val="center"/>
+              <w:rPr>
+                <w:rFonts w:ascii="Arial" w:hAnsi="Arial" w:cs="Arial"/>
+                <w:b/>
+                <w:sz w:val="24"/>
+              </w:rPr>
+            </w:pPr>
+            <w:r>
+              <w:rPr>
+                <w:rFonts w:ascii="Arial" w:hAnsi="Arial" w:cs="Arial"/>
+                <w:b/>
+                <w:sz w:val="24"/>
+              </w:rPr>
+              <w:t>Paraf Hirarki</w:t>
+            </w:r>
+          </w:p>
+        </w:tc>
+      </w:tr>
+      <w:tr>
+        <w:trPr>
+          <w:trHeight w:val="305"/>
+        </w:trPr>
+        <w:tc>
+          <w:tcPr>
+            <w:tcW w:w="546" w:type="dxa"/>
+          </w:tcPr>
+          <w:p>
+            <w:pPr>
+              <w:spacing w:after="160" w:line="259" w:lineRule="auto"/>
+              <w:rPr>
+                <w:rFonts w:ascii="Arial" w:hAnsi="Arial" w:cs="Arial"/>
+                <w:sz w:val="24"/>
+              </w:rPr>
+            </w:pPr>
+            <w:r>
+              <w:rPr>
+                <w:rFonts w:ascii="Arial" w:hAnsi="Arial" w:cs="Arial"/>
+                <w:sz w:val="24"/>
+              </w:rPr>
+              <w:t>1.</w:t>
+            </w:r>
+          </w:p>
+        </w:tc>
+        <w:tc>
+          <w:tcPr>
+            <w:tcW w:w="3277" w:type="dxa"/>
+          </w:tcPr>
+          <w:p>
+            <w:pPr>
+              <w:spacing w:after="160" w:line="259" w:lineRule="auto"/>
+              <w:rPr>
+                <w:rFonts w:ascii="Arial" w:hAnsi="Arial" w:cs="Arial"/>
+                <w:sz w:val="24"/>
+              </w:rPr>
+            </w:pPr>
+            <w:proofErr w:type="spellStart"/>
+            <w:r>
+              <w:rPr>
+                <w:rFonts w:ascii="Arial" w:hAnsi="Arial" w:cs="Arial"/>
+                <w:sz w:val="24"/>
+              </w:rPr>
+              <w:t>{Paraf1}</w:t>
+            </w:r>
+            <w:proofErr w:type="spellEnd"/>
+            <w:r>
+              <w:rPr>
+                <w:rFonts w:ascii="Arial" w:hAnsi="Arial" w:cs="Arial"/>
+                <w:sz w:val="24"/>
+              </w:rPr>
+              <w:t xml:space="preserve"/>
+            </w:r>
+          </w:p>
+        </w:tc>
+        <w:tc>
+          <w:tcPr>
+            <w:tcW w:w="914" w:type="dxa"/>
+          </w:tcPr>
+          <w:p>
+            <w:pPr>
+              <w:spacing w:after="160" w:line="259" w:lineRule="auto"/>
+              <w:rPr>
+                <w:rFonts w:ascii="Arial" w:hAnsi="Arial" w:cs="Arial"/>
+                <w:sz w:val="24"/>
+              </w:rPr>
+            </w:pPr>
+          </w:p>
+        </w:tc>
+      </w:tr>
+      <w:tr>
+        <w:tc>
+          <w:tcPr>
+            <w:tcW w:w="546" w:type="dxa"/>
+          </w:tcPr>
+          <w:p>
+            <w:pPr>
+              <w:spacing w:after="160" w:line="259" w:lineRule="auto"/>
+              <w:rPr>
+                <w:rFonts w:ascii="Arial" w:hAnsi="Arial" w:cs="Arial"/>
+                <w:sz w:val="24"/>
+              </w:rPr>
+            </w:pPr>
+            <w:r>
+              <w:rPr>
+                <w:rFonts w:ascii="Arial" w:hAnsi="Arial" w:cs="Arial"/>
+                <w:sz w:val="24"/>
+              </w:rPr>
+              <w:t>2.</w:t>
+            </w:r>
+          </w:p>
+        </w:tc>
+        <w:tc>
+          <w:tcPr>
+            <w:tcW w:w="3277" w:type="dxa"/>
+          </w:tcPr>
+          <w:p>
+            <w:pPr>
+              <w:spacing w:after="160" w:line="259" w:lineRule="auto"/>
+              <w:rPr>
+                <w:rFonts w:ascii="Arial" w:hAnsi="Arial" w:cs="Arial"/>
+                <w:sz w:val="24"/>
+              </w:rPr>
+            </w:pPr>
+            <w:proofErr w:type="spellStart"/>
+            <w:r>
+              <w:rPr>
+                <w:rFonts w:ascii="Arial" w:hAnsi="Arial" w:cs="Arial"/>
+                <w:sz w:val="24"/>
+              </w:rPr>
+              <w:t>{Paraf2}</w:t>
+            </w:r>
+            <w:proofErr w:type="spellEnd"/>
+            <w:r>
+              <w:rPr>
+                <w:rFonts w:ascii="Arial" w:hAnsi="Arial" w:cs="Arial"/>
+                <w:sz w:val="24"/>
+              </w:rPr>
+              <w:t xml:space="preserve"/>
+            </w:r>
+            <w:proofErr w:type="spellStart"/>
+            <w:r>
+              <w:rPr>
+                <w:rFonts w:ascii="Arial" w:hAnsi="Arial" w:cs="Arial"/>
+                <w:sz w:val="24"/>
+              </w:rPr>
+              <w:t/>
+            </w:r>
+            <w:proofErr w:type="spellEnd"/>
+            <w:r>
+              <w:rPr>
+                <w:rFonts w:ascii="Arial" w:hAnsi="Arial" w:cs="Arial"/>
+                <w:sz w:val="24"/>
+              </w:rPr>
+              <w:t xml:space="preserve"/>
+            </w:r>
+          </w:p>
+        </w:tc>
+        <w:tc>
+          <w:tcPr>
+            <w:tcW w:w="914" w:type="dxa"/>
+          </w:tcPr>
+          <w:p>
+            <w:pPr>
+              <w:spacing w:after="160" w:line="259" w:lineRule="auto"/>
+              <w:rPr>
+                <w:rFonts w:ascii="Arial" w:hAnsi="Arial" w:cs="Arial"/>
+                <w:sz w:val="24"/>
+              </w:rPr>
+            </w:pPr>
+          </w:p>
+        </w:tc>
+      </w:tr>
+      <w:tr>
+        <w:tc>
+          <w:tcPr>
+            <w:tcW w:w="546" w:type="dxa"/>
+          </w:tcPr>
+          <w:p>
+            <w:pPr>
+              <w:spacing w:after="160" w:line="259" w:lineRule="auto"/>
+              <w:rPr>
+                <w:rFonts w:ascii="Arial" w:hAnsi="Arial" w:cs="Arial"/>
+                <w:sz w:val="24"/>
+              </w:rPr>
+            </w:pPr>
+            <w:r>
+              <w:rPr>
+                <w:rFonts w:ascii="Arial" w:hAnsi="Arial" w:cs="Arial"/>
+                <w:sz w:val="24"/>
+              </w:rPr>
+              <w:t>3.</w:t>
+            </w:r>
+          </w:p>
+        </w:tc>
+        <w:tc>
+          <w:tcPr>
+            <w:tcW w:w="3277" w:type="dxa"/>
+          </w:tcPr>
+          <w:p>
+            <w:pPr>
+              <w:spacing w:after="160" w:line="259" w:lineRule="auto"/>
+              <w:rPr>
+                <w:rFonts w:ascii="Arial" w:hAnsi="Arial" w:cs="Arial"/>
+                <w:sz w:val="24"/>
+              </w:rPr>
+            </w:pPr>
+            <w:r>
+              <w:rPr>
+                <w:rFonts w:ascii="Arial" w:hAnsi="Arial" w:cs="Arial"/>
+                <w:sz w:val="24"/>
+              </w:rPr>
+              <w:t xml:space="preserve">{Paraf3}</w:t>
+            </w:r>
+            <w:r>
+              <w:rPr>
+                <w:rFonts w:ascii="Arial" w:hAnsi="Arial" w:cs="Arial"/>
+                <w:sz w:val="24"/>
+              </w:rPr>
+              <w:t/>
+            </w:r>
+          </w:p>
+        </w:tc>
+        <w:tc>
+          <w:tcPr>
+            <w:tcW w:w="914" w:type="dxa"/>
+          </w:tcPr>
+          <w:p>
+            <w:pPr>
+              <w:spacing w:after="160" w:line="259" w:lineRule="auto"/>
+              <w:rPr>
+                <w:rFonts w:ascii="Arial" w:hAnsi="Arial" w:cs="Arial"/>
+                <w:sz w:val="24"/>
+              </w:rPr>
+            </w:pPr>
+          </w:p>
+        </w:tc>
+      </w:tr>
+    </w:tbl>
     <w:sectPr>
       <w:pgSz w:h="18709" w:w="12189" w:orient="portrait"/>
       <w:pgMar w:bottom="1134" w:top="1134" w:left="1440" w:right="1440" w:header="708" w:footer="708"/>

</xml_diff>

<commit_message>
fix(spt): sel KTU sppd_template satu paragraf (buang <w:p> bersarang) + guard struktur
Blok KTU disuntik sebagai <w:p> di dalam <w:p> (CT_P memuat CT_P) -> WordprocessingML tak sah; Word bisa minta repair & buang baris NIP. Kini nama + <w:br/> + NIP. dalam SATU paragraf (rPr Arial sz22 sama). Guard keras: skrip (pDepth max 1/nested 0 + sel KTU satu paragraf) & tests/spt-template-tags.test.mjs. Template diregenerasi dari base pra-patch; diff hanya region KTU. Depth <w:p> 2/1 -> 1/0.
</commit_message>
<xml_diff>
--- a/public/sppd_template.docx
+++ b/public/sppd_template.docx
@@ -3464,23 +3464,22 @@
               </w:rPr>
               <w:t xml:space="preserve">{KtuNama}</w:t>
             </w:r>
-            <w:p>
-              <w:pPr>
-                <w:rPr>
-                  <w:rFonts w:ascii="Arial" w:cs="Arial" w:eastAsia="Arial" w:hAnsi="Arial"/>
-                  <w:sz w:val="22"/>
-                  <w:szCs w:val="22"/>
-                </w:rPr>
-              </w:pPr>
-              <w:r>
-                <w:rPr>
-                  <w:rFonts w:ascii="Arial" w:cs="Arial" w:eastAsia="Arial" w:hAnsi="Arial"/>
-                  <w:sz w:val="22"/>
-                  <w:szCs w:val="22"/>
-                </w:rPr>
-                <w:t xml:space="preserve">NIP. {KtuNIP}</w:t>
-              </w:r>
-            </w:p>
+            <w:r>
+              <w:rPr>
+                <w:rFonts w:ascii="Arial" w:cs="Arial" w:eastAsia="Arial" w:hAnsi="Arial"/>
+                <w:sz w:val="22"/>
+                <w:szCs w:val="22"/>
+              </w:rPr>
+              <w:br/>
+            </w:r>
+            <w:r>
+              <w:rPr>
+                <w:rFonts w:ascii="Arial" w:cs="Arial" w:eastAsia="Arial" w:hAnsi="Arial"/>
+                <w:sz w:val="22"/>
+                <w:szCs w:val="22"/>
+              </w:rPr>
+              <w:t xml:space="preserve">NIP. {KtuNIP}</w:t>
+            </w:r>
           </w:p>
         </w:tc>
       </w:tr>

</xml_diff>